<commit_message>
Complete project cleanup and rebranding
</commit_message>
<xml_diff>
--- a/res/SIO2PC_Build_Instructions.docx
+++ b/res/SIO2PC_Build_Instructions.docx
@@ -1,12 +1,11 @@
 
 <file path=word/document.xml><?xml version="1.0" encoding="utf-8"?>
-<w:document xmlns:o="urn:schemas-microsoft-com:office:office" xmlns:r="http://schemas.openxmlformats.org/officeDocument/2006/relationships" xmlns:v="urn:schemas-microsoft-com:vml" xmlns:w="http://schemas.openxmlformats.org/wordprocessingml/2006/main" xmlns:w10="urn:schemas-microsoft-com:office:word" xmlns:wp="http://schemas.openxmlformats.org/drawingml/2006/wordprocessingDrawing" xmlns:wps="http://schemas.microsoft.com/office/word/2010/wordprocessingShape" xmlns:wpg="http://schemas.microsoft.com/office/word/2010/wordprocessingGroup" xmlns:mc="http://schemas.openxmlformats.org/markup-compatibility/2006" xmlns:wp14="http://schemas.microsoft.com/office/word/2010/wordprocessingDrawing" xmlns:w14="http://schemas.microsoft.com/office/word/2010/wordml" xmlns:w15="http://schemas.microsoft.com/office/word/2012/wordml" mc:Ignorable="w14 wp14 w15">
+<w:document xmlns:o="urn:schemas-microsoft-com:office:office" xmlns:r="http://schemas.openxmlformats.org/officeDocument/2006/relationships" xmlns:v="urn:schemas-microsoft-com:vml" xmlns:w="http://schemas.openxmlformats.org/wordprocessingml/2006/main" xmlns:w10="urn:schemas-microsoft-com:office:word" xmlns:wp="http://schemas.openxmlformats.org/drawingml/2006/wordprocessingDrawing" xmlns:pic="http://schemas.openxmlformats.org/drawingml/2006/picture" xmlns:wps="http://schemas.microsoft.com/office/word/2010/wordprocessingShape" xmlns:wpg="http://schemas.microsoft.com/office/word/2010/wordprocessingGroup" xmlns:mc="http://schemas.openxmlformats.org/markup-compatibility/2006" xmlns:wp14="http://schemas.microsoft.com/office/word/2010/wordprocessingDrawing" xmlns:w14="http://schemas.microsoft.com/office/word/2010/wordml" xmlns:w15="http://schemas.microsoft.com/office/word/2012/wordml" mc:Ignorable="w14 wp14 w15">
   <w:body>
     <w:p>
       <w:pPr>
         <w:pStyle w:val="Normal"/>
         <w:rPr>
-          <w:b/>
           <w:b/>
           <w:sz w:val="28"/>
           <w:u w:val="single"/>
@@ -18,23 +17,7 @@
           <w:sz w:val="28"/>
           <w:u w:val="single"/>
         </w:rPr>
-        <w:t>Atari SIO2PC Build Instructions for AspeQt (2k2</w:t>
-      </w:r>
-      <w:r>
-        <w:rPr>
-          <w:b/>
-          <w:sz w:val="28"/>
-          <w:u w:val="single"/>
-        </w:rPr>
-        <w:t>4</w:t>
-      </w:r>
-      <w:r>
-        <w:rPr>
-          <w:b/>
-          <w:sz w:val="28"/>
-          <w:u w:val="single"/>
-        </w:rPr>
-        <w:t>)</w:t>
+        <w:t>Atari SIO2PC Build Instructions for AspeQt-2K26</w:t>
       </w:r>
     </w:p>
     <w:p>
@@ -57,7 +40,7 @@
       </w:r>
       <w:r>
         <w:rPr>
-          <w:rStyle w:val="InternetLink"/>
+          <w:rStyle w:val="Hyperlink"/>
           <w:sz w:val="20"/>
           <w:b/>
           <w:szCs w:val="20"/>
@@ -67,7 +50,7 @@
       </w:r>
       <w:r>
         <w:rPr>
-          <w:rStyle w:val="InternetLink"/>
+          <w:rStyle w:val="Hyperlink"/>
           <w:sz w:val="20"/>
           <w:b/>
           <w:szCs w:val="20"/>
@@ -77,7 +60,7 @@
       </w:r>
       <w:r>
         <w:rPr>
-          <w:rStyle w:val="InternetLink"/>
+          <w:rStyle w:val="Hyperlink"/>
           <w:b/>
           <w:bCs/>
           <w:sz w:val="20"/>
@@ -87,7 +70,7 @@
       </w:r>
       <w:r>
         <w:rPr>
-          <w:rStyle w:val="InternetLink"/>
+          <w:rStyle w:val="Hyperlink"/>
           <w:sz w:val="20"/>
           <w:b/>
           <w:szCs w:val="20"/>
@@ -112,9 +95,8 @@
         <w:pStyle w:val="Normal"/>
         <w:rPr>
           <w:b/>
-          <w:b/>
           <w:bCs/>
-          <w:color w:val="0563C1" w:themeColor="hyperlink"/>
+          <w:color w:themeColor="hyperlink" w:val="0563C1"/>
           <w:sz w:val="20"/>
           <w:szCs w:val="20"/>
           <w:u w:val="single"/>
@@ -139,7 +121,7 @@
       <w:hyperlink r:id="rId2">
         <w:r>
           <w:rPr>
-            <w:rStyle w:val="InternetLink"/>
+            <w:rStyle w:val="Hyperlink"/>
             <w:b/>
             <w:bCs/>
             <w:sz w:val="20"/>
@@ -150,7 +132,7 @@
       </w:hyperlink>
       <w:r>
         <w:rPr>
-          <w:rStyle w:val="InternetLink"/>
+          <w:rStyle w:val="Hyperlink"/>
           <w:b/>
           <w:bCs/>
           <w:sz w:val="20"/>
@@ -164,9 +146,8 @@
         <w:pStyle w:val="Normal"/>
         <w:rPr>
           <w:b/>
-          <w:b/>
           <w:bCs/>
-          <w:color w:val="0563C1" w:themeColor="hyperlink"/>
+          <w:color w:themeColor="hyperlink" w:val="0563C1"/>
           <w:sz w:val="20"/>
           <w:szCs w:val="20"/>
           <w:u w:val="single"/>
@@ -176,7 +157,7 @@
         <w:rPr>
           <w:b/>
           <w:bCs/>
-          <w:color w:val="0563C1" w:themeColor="hyperlink"/>
+          <w:color w:themeColor="hyperlink" w:val="0563C1"/>
           <w:sz w:val="20"/>
           <w:szCs w:val="20"/>
           <w:u w:val="single"/>
@@ -196,6 +177,24 @@
           <w:sz w:val="24"/>
           <w:u w:val="single"/>
         </w:rPr>
+      </w:r>
+      <w:r>
+        <w:br w:type="page"/>
+      </w:r>
+    </w:p>
+    <w:p>
+      <w:pPr>
+        <w:pStyle w:val="Normal"/>
+        <w:rPr>
+          <w:sz w:val="24"/>
+          <w:u w:val="single"/>
+        </w:rPr>
+      </w:pPr>
+      <w:r>
+        <w:rPr>
+          <w:sz w:val="24"/>
+          <w:u w:val="single"/>
+        </w:rPr>
         <w:t>SIO2PC Cable Using USB-TTL PL2303TA Chipset</w:t>
       </w:r>
     </w:p>
@@ -203,7 +202,6 @@
       <w:pPr>
         <w:pStyle w:val="Normal"/>
         <w:rPr>
-          <w:b/>
           <w:b/>
           <w:bCs/>
           <w:sz w:val="24"/>
@@ -252,7 +250,6 @@
       <w:pPr>
         <w:pStyle w:val="Normal"/>
         <w:rPr>
-          <w:b/>
           <w:b/>
           <w:bCs/>
           <w:sz w:val="24"/>
@@ -325,6 +322,7 @@
                     <a:prstGeom prst="rect">
                       <a:avLst/>
                     </a:prstGeom>
+                    <a:noFill/>
                   </pic:spPr>
                 </pic:pic>
               </a:graphicData>
@@ -370,6 +368,7 @@
                     <a:prstGeom prst="rect">
                       <a:avLst/>
                     </a:prstGeom>
+                    <a:noFill/>
                   </pic:spPr>
                 </pic:pic>
               </a:graphicData>
@@ -411,7 +410,7 @@
         <mc:AlternateContent>
           <mc:Choice Requires="wps">
             <w:drawing>
-              <wp:anchor behindDoc="0" distT="19050" distB="45085" distL="19050" distR="19050" simplePos="0" locked="0" layoutInCell="0" allowOverlap="1" relativeHeight="10" wp14:anchorId="22C767D8">
+              <wp:anchor behindDoc="0" distT="15875" distB="16510" distL="10160" distR="6350" simplePos="0" locked="0" layoutInCell="1" allowOverlap="1" relativeHeight="10" wp14:anchorId="22C767D8">
                 <wp:simplePos x="0" y="0"/>
                 <wp:positionH relativeFrom="column">
                   <wp:posOffset>1435735</wp:posOffset>
@@ -525,7 +524,7 @@
         <mc:AlternateContent>
           <mc:Choice Requires="wps">
             <w:drawing>
-              <wp:anchor behindDoc="0" distT="19050" distB="32385" distL="0" distR="43180" simplePos="0" locked="0" layoutInCell="0" allowOverlap="1" relativeHeight="9" wp14:anchorId="297619AC">
+              <wp:anchor behindDoc="0" distT="16510" distB="15875" distL="6350" distR="10160" simplePos="0" locked="0" layoutInCell="1" allowOverlap="1" relativeHeight="9" wp14:anchorId="297619AC">
                 <wp:simplePos x="0" y="0"/>
                 <wp:positionH relativeFrom="column">
                   <wp:posOffset>1465580</wp:posOffset>
@@ -614,7 +613,7 @@
         <mc:AlternateContent>
           <mc:Choice Requires="wps">
             <w:drawing>
-              <wp:anchor behindDoc="0" distT="0" distB="15875" distL="0" distR="11430" simplePos="0" locked="0" layoutInCell="0" allowOverlap="1" relativeHeight="11" wp14:anchorId="31D531A6">
+              <wp:anchor behindDoc="0" distT="7620" distB="6350" distL="6350" distR="6985" simplePos="0" locked="0" layoutInCell="1" allowOverlap="1" relativeHeight="11" wp14:anchorId="31D531A6">
                 <wp:simplePos x="0" y="0"/>
                 <wp:positionH relativeFrom="column">
                   <wp:posOffset>1471930</wp:posOffset>
@@ -829,6 +828,24 @@
           <w:sz w:val="24"/>
           <w:u w:val="single"/>
         </w:rPr>
+      </w:r>
+      <w:r>
+        <w:br w:type="page"/>
+      </w:r>
+    </w:p>
+    <w:p>
+      <w:pPr>
+        <w:pStyle w:val="Normal"/>
+        <w:rPr>
+          <w:sz w:val="24"/>
+          <w:u w:val="single"/>
+        </w:rPr>
+      </w:pPr>
+      <w:r>
+        <w:rPr>
+          <w:sz w:val="24"/>
+          <w:u w:val="single"/>
+        </w:rPr>
         <w:t>SIO2PC Cable Using USB-TTL FTDI FT232RL Chipset</w:t>
       </w:r>
     </w:p>
@@ -836,7 +853,6 @@
       <w:pPr>
         <w:pStyle w:val="Normal"/>
         <w:rPr>
-          <w:b/>
           <w:b/>
           <w:bCs/>
         </w:rPr>
@@ -938,6 +954,7 @@
                     <a:prstGeom prst="rect">
                       <a:avLst/>
                     </a:prstGeom>
+                    <a:noFill/>
                   </pic:spPr>
                 </pic:pic>
               </a:graphicData>
@@ -983,6 +1000,7 @@
                     <a:prstGeom prst="rect">
                       <a:avLst/>
                     </a:prstGeom>
+                    <a:noFill/>
                   </pic:spPr>
                 </pic:pic>
               </a:graphicData>
@@ -1020,7 +1038,7 @@
         <mc:AlternateContent>
           <mc:Choice Requires="wps">
             <w:drawing>
-              <wp:anchor behindDoc="0" distT="19050" distB="45085" distL="19050" distR="14605" simplePos="0" locked="0" layoutInCell="0" allowOverlap="1" relativeHeight="12" wp14:anchorId="5F258393">
+              <wp:anchor behindDoc="0" distT="15875" distB="16510" distL="10160" distR="6350" simplePos="0" locked="0" layoutInCell="1" allowOverlap="1" relativeHeight="12" wp14:anchorId="5F258393">
                 <wp:simplePos x="0" y="0"/>
                 <wp:positionH relativeFrom="column">
                   <wp:posOffset>1371600</wp:posOffset>
@@ -1131,7 +1149,7 @@
                   <a:graphicData uri="http://schemas.openxmlformats.org/drawingml/2006/picture">
                     <pic:pic xmlns:pic="http://schemas.openxmlformats.org/drawingml/2006/picture">
                       <pic:nvPicPr>
-                        <pic:cNvPr id="0" name="Picture 4" descr=""/>
+                        <pic:cNvPr id="10" name="Picture 4" descr=""/>
                         <pic:cNvPicPr/>
                       </pic:nvPicPr>
                       <pic:blipFill>
@@ -1146,6 +1164,7 @@
                         <a:prstGeom prst="rect">
                           <a:avLst/>
                         </a:prstGeom>
+                        <a:noFill/>
                         <a:ln w="0">
                           <a:noFill/>
                         </a:ln>
@@ -1210,7 +1229,7 @@
           <wp:inline distT="0" distB="0" distL="0" distR="0">
             <wp:extent cx="2319655" cy="182880"/>
             <wp:effectExtent l="0" t="0" r="0" b="0"/>
-            <wp:docPr id="10" name="Picture 17" descr=""/>
+            <wp:docPr id="11" name="Picture 17" descr=""/>
             <wp:cNvGraphicFramePr>
               <a:graphicFrameLocks xmlns:a="http://schemas.openxmlformats.org/drawingml/2006/main" noChangeAspect="1"/>
             </wp:cNvGraphicFramePr>
@@ -1218,7 +1237,7 @@
               <a:graphicData uri="http://schemas.openxmlformats.org/drawingml/2006/picture">
                 <pic:pic xmlns:pic="http://schemas.openxmlformats.org/drawingml/2006/picture">
                   <pic:nvPicPr>
-                    <pic:cNvPr id="10" name="Picture 17" descr=""/>
+                    <pic:cNvPr id="11" name="Picture 17" descr=""/>
                     <pic:cNvPicPr>
                       <a:picLocks noChangeAspect="1" noChangeArrowheads="1"/>
                     </pic:cNvPicPr>
@@ -1237,6 +1256,7 @@
                     <a:prstGeom prst="rect">
                       <a:avLst/>
                     </a:prstGeom>
+                    <a:noFill/>
                   </pic:spPr>
                 </pic:pic>
               </a:graphicData>
@@ -1278,7 +1298,7 @@
           <wp:inline distT="0" distB="0" distL="0" distR="0">
             <wp:extent cx="2328545" cy="94615"/>
             <wp:effectExtent l="0" t="0" r="0" b="0"/>
-            <wp:docPr id="11" name="Picture 15" descr=""/>
+            <wp:docPr id="12" name="Picture 15" descr=""/>
             <wp:cNvGraphicFramePr>
               <a:graphicFrameLocks xmlns:a="http://schemas.openxmlformats.org/drawingml/2006/main" noChangeAspect="1"/>
             </wp:cNvGraphicFramePr>
@@ -1286,7 +1306,7 @@
               <a:graphicData uri="http://schemas.openxmlformats.org/drawingml/2006/picture">
                 <pic:pic xmlns:pic="http://schemas.openxmlformats.org/drawingml/2006/picture">
                   <pic:nvPicPr>
-                    <pic:cNvPr id="11" name="Picture 15" descr=""/>
+                    <pic:cNvPr id="12" name="Picture 15" descr=""/>
                     <pic:cNvPicPr>
                       <a:picLocks noChangeAspect="1" noChangeArrowheads="1"/>
                     </pic:cNvPicPr>
@@ -1305,6 +1325,7 @@
                     <a:prstGeom prst="rect">
                       <a:avLst/>
                     </a:prstGeom>
+                    <a:noFill/>
                   </pic:spPr>
                 </pic:pic>
               </a:graphicData>
@@ -1805,6 +1826,7 @@
     <w:rsid w:val="00b61221"/>
     <w:pPr>
       <w:widowControl/>
+      <w:suppressAutoHyphens w:val="true"/>
       <w:bidi w:val="0"/>
       <w:spacing w:lineRule="auto" w:line="259" w:before="0" w:after="160"/>
       <w:jc w:val="left"/>
@@ -1826,14 +1848,14 @@
     <w:qFormat/>
     <w:rPr/>
   </w:style>
-  <w:style w:type="character" w:styleId="InternetLink">
+  <w:style w:type="character" w:styleId="Hyperlink">
     <w:name w:val="Hyperlink"/>
     <w:basedOn w:val="DefaultParagraphFont"/>
     <w:uiPriority w:val="99"/>
     <w:unhideWhenUsed/>
     <w:rsid w:val="000e0ad0"/>
     <w:rPr>
-      <w:color w:val="0563C1" w:themeColor="hyperlink"/>
+      <w:color w:themeColor="hyperlink" w:val="0563C1"/>
       <w:u w:val="single"/>
     </w:rPr>
   </w:style>
@@ -1853,7 +1875,7 @@
   <w:style w:type="paragraph" w:styleId="Heading">
     <w:name w:val="Heading"/>
     <w:basedOn w:val="Normal"/>
-    <w:next w:val="TextBody"/>
+    <w:next w:val="BodyText"/>
     <w:qFormat/>
     <w:pPr>
       <w:keepNext w:val="true"/>
@@ -1865,7 +1887,7 @@
       <w:szCs w:val="28"/>
     </w:rPr>
   </w:style>
-  <w:style w:type="paragraph" w:styleId="TextBody">
+  <w:style w:type="paragraph" w:styleId="BodyText">
     <w:name w:val="Body Text"/>
     <w:basedOn w:val="Normal"/>
     <w:pPr>
@@ -1875,14 +1897,14 @@
   </w:style>
   <w:style w:type="paragraph" w:styleId="List">
     <w:name w:val="List"/>
-    <w:basedOn w:val="TextBody"/>
+    <w:basedOn w:val="BodyText"/>
     <w:pPr/>
     <w:rPr>
       <w:rFonts w:cs="Lohit Devanagari"/>
     </w:rPr>
   </w:style>
   <w:style w:type="paragraph" w:styleId="Caption">
-    <w:name w:val="Caption"/>
+    <w:name w:val="caption"/>
     <w:basedOn w:val="Normal"/>
     <w:qFormat/>
     <w:pPr>
@@ -1933,161 +1955,97 @@
 </file>
 
 <file path=word/theme/theme1.xml><?xml version="1.0" encoding="utf-8"?>
-<a:theme xmlns:a="http://schemas.openxmlformats.org/drawingml/2006/main" name="Office Theme">
+<a:theme xmlns:a="http://schemas.openxmlformats.org/drawingml/2006/main" xmlns:r="http://schemas.openxmlformats.org/officeDocument/2006/relationships" name="Office Theme">
   <a:themeElements>
     <a:clrScheme name="Office">
       <a:dk1>
-        <a:sysClr val="windowText" lastClr="000000"/>
+        <a:srgbClr val="000000"/>
       </a:dk1>
       <a:lt1>
-        <a:sysClr val="window" lastClr="FFFFFF"/>
+        <a:srgbClr val="ffffff"/>
       </a:lt1>
       <a:dk2>
-        <a:srgbClr val="44546A"/>
+        <a:srgbClr val="44546a"/>
       </a:dk2>
       <a:lt2>
-        <a:srgbClr val="E7E6E6"/>
+        <a:srgbClr val="e7e6e6"/>
       </a:lt2>
       <a:accent1>
-        <a:srgbClr val="5B9BD5"/>
+        <a:srgbClr val="5b9bd5"/>
       </a:accent1>
       <a:accent2>
-        <a:srgbClr val="ED7D31"/>
+        <a:srgbClr val="ed7d31"/>
       </a:accent2>
       <a:accent3>
-        <a:srgbClr val="A5A5A5"/>
+        <a:srgbClr val="a5a5a5"/>
       </a:accent3>
       <a:accent4>
-        <a:srgbClr val="FFC000"/>
+        <a:srgbClr val="ffc000"/>
       </a:accent4>
       <a:accent5>
-        <a:srgbClr val="4472C4"/>
+        <a:srgbClr val="4472c4"/>
       </a:accent5>
       <a:accent6>
-        <a:srgbClr val="70AD47"/>
+        <a:srgbClr val="70ad47"/>
       </a:accent6>
       <a:hlink>
-        <a:srgbClr val="0563C1"/>
+        <a:srgbClr val="0563c1"/>
       </a:hlink>
       <a:folHlink>
-        <a:srgbClr val="954F72"/>
+        <a:srgbClr val="954f72"/>
       </a:folHlink>
     </a:clrScheme>
     <a:fontScheme name="Office">
       <a:majorFont>
-        <a:latin typeface="Calibri Light" panose="020F0302020204030204"/>
+        <a:latin typeface="Calibri Light" panose="020F0302020204030204" pitchFamily="0" charset="1"/>
         <a:ea typeface=""/>
         <a:cs typeface=""/>
-        <a:font script="Jpan" typeface="ＭＳ ゴシック"/>
-        <a:font script="Hang" typeface="맑은 고딕"/>
-        <a:font script="Hans" typeface="宋体"/>
-        <a:font script="Hant" typeface="新細明體"/>
-        <a:font script="Arab" typeface="Times New Roman"/>
-        <a:font script="Hebr" typeface="Times New Roman"/>
-        <a:font script="Thai" typeface="Angsana New"/>
-        <a:font script="Ethi" typeface="Nyala"/>
-        <a:font script="Beng" typeface="Vrinda"/>
-        <a:font script="Gujr" typeface="Shruti"/>
-        <a:font script="Khmr" typeface="MoolBoran"/>
-        <a:font script="Knda" typeface="Tunga"/>
-        <a:font script="Guru" typeface="Raavi"/>
-        <a:font script="Cans" typeface="Euphemia"/>
-        <a:font script="Cher" typeface="Plantagenet Cherokee"/>
-        <a:font script="Yiii" typeface="Microsoft Yi Baiti"/>
-        <a:font script="Tibt" typeface="Microsoft Himalaya"/>
-        <a:font script="Thaa" typeface="MV Boli"/>
-        <a:font script="Deva" typeface="Mangal"/>
-        <a:font script="Telu" typeface="Gautami"/>
-        <a:font script="Taml" typeface="Latha"/>
-        <a:font script="Syrc" typeface="Estrangelo Edessa"/>
-        <a:font script="Orya" typeface="Kalinga"/>
-        <a:font script="Mlym" typeface="Kartika"/>
-        <a:font script="Laoo" typeface="DokChampa"/>
-        <a:font script="Sinh" typeface="Iskoola Pota"/>
-        <a:font script="Mong" typeface="Mongolian Baiti"/>
-        <a:font script="Viet" typeface="Times New Roman"/>
-        <a:font script="Uigh" typeface="Microsoft Uighur"/>
-        <a:font script="Geor" typeface="Sylfaen"/>
       </a:majorFont>
       <a:minorFont>
-        <a:latin typeface="Calibri" panose="020F0502020204030204"/>
+        <a:latin typeface="Calibri" panose="020F0502020204030204" pitchFamily="0" charset="1"/>
         <a:ea typeface=""/>
         <a:cs typeface=""/>
-        <a:font script="Jpan" typeface="ＭＳ 明朝"/>
-        <a:font script="Hang" typeface="맑은 고딕"/>
-        <a:font script="Hans" typeface="宋体"/>
-        <a:font script="Hant" typeface="新細明體"/>
-        <a:font script="Arab" typeface="Arial"/>
-        <a:font script="Hebr" typeface="Arial"/>
-        <a:font script="Thai" typeface="Cordia New"/>
-        <a:font script="Ethi" typeface="Nyala"/>
-        <a:font script="Beng" typeface="Vrinda"/>
-        <a:font script="Gujr" typeface="Shruti"/>
-        <a:font script="Khmr" typeface="DaunPenh"/>
-        <a:font script="Knda" typeface="Tunga"/>
-        <a:font script="Guru" typeface="Raavi"/>
-        <a:font script="Cans" typeface="Euphemia"/>
-        <a:font script="Cher" typeface="Plantagenet Cherokee"/>
-        <a:font script="Yiii" typeface="Microsoft Yi Baiti"/>
-        <a:font script="Tibt" typeface="Microsoft Himalaya"/>
-        <a:font script="Thaa" typeface="MV Boli"/>
-        <a:font script="Deva" typeface="Mangal"/>
-        <a:font script="Telu" typeface="Gautami"/>
-        <a:font script="Taml" typeface="Latha"/>
-        <a:font script="Syrc" typeface="Estrangelo Edessa"/>
-        <a:font script="Orya" typeface="Kalinga"/>
-        <a:font script="Mlym" typeface="Kartika"/>
-        <a:font script="Laoo" typeface="DokChampa"/>
-        <a:font script="Sinh" typeface="Iskoola Pota"/>
-        <a:font script="Mong" typeface="Mongolian Baiti"/>
-        <a:font script="Viet" typeface="Arial"/>
-        <a:font script="Uigh" typeface="Microsoft Uighur"/>
-        <a:font script="Geor" typeface="Sylfaen"/>
       </a:minorFont>
     </a:fontScheme>
-    <a:fmtScheme name="Office">
+    <a:fmtScheme>
       <a:fillStyleLst>
         <a:solidFill>
           <a:schemeClr val="phClr"/>
         </a:solidFill>
-        <a:gradFill rotWithShape="1">
+        <a:gradFill>
           <a:gsLst>
             <a:gs pos="0">
               <a:schemeClr val="phClr">
                 <a:lumMod val="110000"/>
-                <a:satMod val="105000"/>
                 <a:tint val="67000"/>
               </a:schemeClr>
             </a:gs>
             <a:gs pos="50000">
               <a:schemeClr val="phClr">
                 <a:lumMod val="105000"/>
-                <a:satMod val="103000"/>
                 <a:tint val="73000"/>
               </a:schemeClr>
             </a:gs>
             <a:gs pos="100000">
               <a:schemeClr val="phClr">
                 <a:lumMod val="105000"/>
-                <a:satMod val="109000"/>
                 <a:tint val="81000"/>
               </a:schemeClr>
             </a:gs>
           </a:gsLst>
           <a:lin ang="5400000" scaled="0"/>
+          <a:tileRect l="0" t="0" r="0" b="0"/>
         </a:gradFill>
-        <a:gradFill rotWithShape="1">
+        <a:gradFill>
           <a:gsLst>
             <a:gs pos="0">
               <a:schemeClr val="phClr">
-                <a:satMod val="103000"/>
                 <a:lumMod val="102000"/>
                 <a:tint val="94000"/>
               </a:schemeClr>
             </a:gs>
             <a:gs pos="50000">
               <a:schemeClr val="phClr">
-                <a:satMod val="110000"/>
                 <a:lumMod val="100000"/>
                 <a:shade val="100000"/>
               </a:schemeClr>
@@ -2095,33 +2053,24 @@
             <a:gs pos="100000">
               <a:schemeClr val="phClr">
                 <a:lumMod val="99000"/>
-                <a:satMod val="120000"/>
                 <a:shade val="78000"/>
               </a:schemeClr>
             </a:gs>
           </a:gsLst>
           <a:lin ang="5400000" scaled="0"/>
+          <a:tileRect l="0" t="0" r="0" b="0"/>
         </a:gradFill>
       </a:fillStyleLst>
       <a:lnStyleLst>
         <a:ln w="6350" cap="flat" cmpd="sng" algn="ctr">
-          <a:solidFill>
-            <a:schemeClr val="phClr"/>
-          </a:solidFill>
           <a:prstDash val="solid"/>
           <a:miter lim="800000"/>
         </a:ln>
         <a:ln w="12700" cap="flat" cmpd="sng" algn="ctr">
-          <a:solidFill>
-            <a:schemeClr val="phClr"/>
-          </a:solidFill>
           <a:prstDash val="solid"/>
           <a:miter lim="800000"/>
         </a:ln>
         <a:ln w="19050" cap="flat" cmpd="sng" algn="ctr">
-          <a:solidFill>
-            <a:schemeClr val="phClr"/>
-          </a:solidFill>
           <a:prstDash val="solid"/>
           <a:miter lim="800000"/>
         </a:ln>
@@ -2134,13 +2083,7 @@
           <a:effectLst/>
         </a:effectStyle>
         <a:effectStyle>
-          <a:effectLst>
-            <a:outerShdw blurRad="57150" dist="19050" dir="5400000" algn="ctr" rotWithShape="0">
-              <a:srgbClr val="000000">
-                <a:alpha val="63000"/>
-              </a:srgbClr>
-            </a:outerShdw>
-          </a:effectLst>
+          <a:effectLst/>
         </a:effectStyle>
       </a:effectStyleLst>
       <a:bgFillStyleLst>
@@ -2150,15 +2093,13 @@
         <a:solidFill>
           <a:schemeClr val="phClr">
             <a:tint val="95000"/>
-            <a:satMod val="170000"/>
           </a:schemeClr>
         </a:solidFill>
-        <a:gradFill rotWithShape="1">
+        <a:gradFill>
           <a:gsLst>
             <a:gs pos="0">
               <a:schemeClr val="phClr">
                 <a:tint val="93000"/>
-                <a:satMod val="150000"/>
                 <a:shade val="98000"/>
                 <a:lumMod val="102000"/>
               </a:schemeClr>
@@ -2166,7 +2107,6 @@
             <a:gs pos="50000">
               <a:schemeClr val="phClr">
                 <a:tint val="98000"/>
-                <a:satMod val="130000"/>
                 <a:shade val="90000"/>
                 <a:lumMod val="103000"/>
               </a:schemeClr>
@@ -2174,21 +2114,14 @@
             <a:gs pos="100000">
               <a:schemeClr val="phClr">
                 <a:shade val="63000"/>
-                <a:satMod val="120000"/>
               </a:schemeClr>
             </a:gs>
           </a:gsLst>
           <a:lin ang="5400000" scaled="0"/>
+          <a:tileRect l="0" t="0" r="0" b="0"/>
         </a:gradFill>
       </a:bgFillStyleLst>
     </a:fmtScheme>
   </a:themeElements>
-  <a:objectDefaults/>
-  <a:extraClrSchemeLst/>
-  <a:extLst>
-    <a:ext uri="{05A4C25C-085E-4340-85A3-A5531E510DB2}">
-      <thm15:themeFamily xmlns:thm15="http://schemas.microsoft.com/office/thememl/2012/main" name="Office Theme" id="{62F939B6-93AF-4DB8-9C6B-D6C7DFDC589F}" vid="{4A3C46E8-61CC-4603-A589-7422A47A8E4A}"/>
-    </a:ext>
-  </a:extLst>
 </a:theme>
 </file>
</xml_diff>